<commit_message>
test: refresh Word matrices with native math corrections
</commit_message>
<xml_diff>
--- a/scripts/fixtures/word-acceptance/aspect-feature-specimen.docx
+++ b/scripts/fixtures/word-acceptance/aspect-feature-specimen.docx
@@ -30321,16 +30321,16 @@
               <w:t xml:space="preserve">FMT2722 </w:t>
             </w:r>
             <m:oMath xmlns:m="http://schemas.openxmlformats.org/officeDocument/2006/math" xmlns:w="http://schemas.openxmlformats.org/wordprocessingml/2006/main">
-              <m:acc>
-                <m:accPr>
-                  <m:chr m:val="‾"/>
-                </m:accPr>
+              <m:bar>
+                <m:barPr>
+                  <m:pos m:val="top"/>
+                </m:barPr>
                 <m:e>
                   <m:r>
                     <m:t xml:space="preserve">S∩M</m:t>
                   </m:r>
                 </m:e>
-              </m:acc>
+              </m:bar>
             </m:oMath>
             <w:r>
               <w:rPr>
@@ -30434,16 +30434,16 @@
               <w:t xml:space="preserve">FMT2723 </w:t>
             </w:r>
             <m:oMath xmlns:m="http://schemas.openxmlformats.org/officeDocument/2006/math" xmlns:w="http://schemas.openxmlformats.org/wordprocessingml/2006/main">
-              <m:acc>
-                <m:accPr>
-                  <m:chr m:val="‾"/>
-                </m:accPr>
+              <m:bar>
+                <m:barPr>
+                  <m:pos m:val="top"/>
+                </m:barPr>
                 <m:e>
                   <m:r>
                     <m:t xml:space="preserve">S∩M</m:t>
                   </m:r>
                 </m:e>
-              </m:acc>
+              </m:bar>
             </m:oMath>
             <w:r>
               <w:rPr>
@@ -30547,16 +30547,16 @@
               <w:t xml:space="preserve">FMT2724 </w:t>
             </w:r>
             <m:oMath xmlns:m="http://schemas.openxmlformats.org/officeDocument/2006/math" xmlns:w="http://schemas.openxmlformats.org/wordprocessingml/2006/main">
-              <m:acc>
-                <m:accPr>
-                  <m:chr m:val="‾"/>
-                </m:accPr>
+              <m:bar>
+                <m:barPr>
+                  <m:pos m:val="top"/>
+                </m:barPr>
                 <m:e>
                   <m:r>
                     <m:t xml:space="preserve">S∩M</m:t>
                   </m:r>
                 </m:e>
-              </m:acc>
+              </m:bar>
             </m:oMath>
             <w:r>
               <w:rPr>
@@ -30660,16 +30660,16 @@
               <w:t xml:space="preserve">FMT2725 </w:t>
             </w:r>
             <m:oMath xmlns:m="http://schemas.openxmlformats.org/officeDocument/2006/math" xmlns:w="http://schemas.openxmlformats.org/wordprocessingml/2006/main">
-              <m:acc>
-                <m:accPr>
-                  <m:chr m:val="‾"/>
-                </m:accPr>
+              <m:bar>
+                <m:barPr>
+                  <m:pos m:val="top"/>
+                </m:barPr>
                 <m:e>
                   <m:r>
                     <m:t xml:space="preserve">S∩M</m:t>
                   </m:r>
                 </m:e>
-              </m:acc>
+              </m:bar>
             </m:oMath>
             <w:r>
               <w:rPr>

</xml_diff>